<commit_message>
Indent tables nested in block quotes and list items (#20)
</commit_message>
<xml_diff>
--- a/src/Parchment.Tests/NaughtyStringsTests.Markdown.verified.docx
+++ b/src/Parchment.Tests/NaughtyStringsTests.Markdown.verified.docx
@@ -1653,32 +1653,17 @@
     </w:p>
     <w:p>
       <w:pPr>
-        <w:pStyle w:val="ListParagraph"/>
-        <w:numPr>
-          <w:ilvl w:val="0"/>
-          <w:numId w:val="1"/>
-        </w:numPr>
-        <w:contextualSpacing/>
-      </w:pPr>
-    </w:p>
-    <w:p>
-      <w:pPr>
-        <w:pStyle w:val="ListParagraph"/>
-        <w:numPr>
-          <w:ilvl w:val="0"/>
-          <w:numId w:val="1"/>
-        </w:numPr>
-        <w:contextualSpacing/>
-      </w:pPr>
-    </w:p>
-    <w:p>
-      <w:pPr>
-        <w:pStyle w:val="ListParagraph"/>
-        <w:numPr>
-          <w:ilvl w:val="0"/>
-          <w:numId w:val="1"/>
-        </w:numPr>
-        <w:contextualSpacing/>
+        <w:ind w:left="480"/>
+      </w:pPr>
+    </w:p>
+    <w:p>
+      <w:pPr>
+        <w:ind w:left="480"/>
+      </w:pPr>
+    </w:p>
+    <w:p>
+      <w:pPr>
+        <w:ind w:left="480"/>
       </w:pPr>
     </w:p>
     <w:p>
@@ -2860,12 +2845,7 @@
     </w:p>
     <w:p>
       <w:pPr>
-        <w:pStyle w:val="ListParagraph"/>
-        <w:numPr>
-          <w:ilvl w:val="0"/>
-          <w:numId w:val="1"/>
-        </w:numPr>
-        <w:contextualSpacing/>
+        <w:ind w:left="480"/>
       </w:pPr>
     </w:p>
     <w:p>
@@ -2895,12 +2875,7 @@
     </w:p>
     <w:p>
       <w:pPr>
-        <w:pStyle w:val="ListParagraph"/>
-        <w:numPr>
-          <w:ilvl w:val="0"/>
-          <w:numId w:val="1"/>
-        </w:numPr>
-        <w:contextualSpacing/>
+        <w:ind w:left="480"/>
       </w:pPr>
     </w:p>
     <w:p>
@@ -2977,7 +2952,7 @@
     </w:p>
     <w:p>
       <w:pPr>
-        <w:pStyle w:val="Quote"/>
+        <w:ind w:left="1200"/>
       </w:pPr>
     </w:p>
     <w:p>
@@ -3246,7 +3221,7 @@
     </w:p>
     <w:p>
       <w:pPr>
-        <w:pStyle w:val="Quote"/>
+        <w:ind w:left="1200"/>
       </w:pPr>
     </w:p>
     <w:p>
@@ -6907,12 +6882,7 @@
     </w:p>
     <w:p>
       <w:pPr>
-        <w:pStyle w:val="ListParagraph"/>
-        <w:numPr>
-          <w:ilvl w:val="0"/>
-          <w:numId w:val="1"/>
-        </w:numPr>
-        <w:contextualSpacing/>
+        <w:ind w:left="480"/>
       </w:pPr>
     </w:p>
     <w:p>
@@ -6948,42 +6918,12 @@
     </w:p>
     <w:p>
       <w:pPr>
-        <w:pStyle w:val="ListParagraph"/>
-        <w:numPr>
-          <w:ilvl w:val="0"/>
-          <w:numId w:val="1"/>
-        </w:numPr>
-        <w:contextualSpacing/>
-      </w:pPr>
-    </w:p>
-    <w:p>
-      <w:pPr>
-        <w:pStyle w:val="ListParagraph"/>
-        <w:numPr>
-          <w:ilvl w:val="0"/>
-          <w:numId w:val="1"/>
-        </w:numPr>
-        <w:contextualSpacing/>
-      </w:pPr>
-    </w:p>
-    <w:p>
-      <w:pPr>
-        <w:pStyle w:val="ListParagraph"/>
-        <w:numPr>
-          <w:ilvl w:val="0"/>
-          <w:numId w:val="1"/>
-        </w:numPr>
-        <w:contextualSpacing/>
-      </w:pPr>
-    </w:p>
-    <w:p>
-      <w:pPr>
-        <w:pStyle w:val="ListParagraph"/>
-        <w:numPr>
-          <w:ilvl w:val="0"/>
-          <w:numId w:val="1"/>
-        </w:numPr>
-        <w:contextualSpacing/>
+        <w:ind w:left="480"/>
+      </w:pPr>
+    </w:p>
+    <w:p>
+      <w:pPr>
+        <w:ind w:left="480"/>
       </w:pPr>
     </w:p>
     <w:p>
@@ -7031,22 +6971,12 @@
     </w:p>
     <w:p>
       <w:pPr>
-        <w:pStyle w:val="ListParagraph"/>
-        <w:numPr>
-          <w:ilvl w:val="0"/>
-          <w:numId w:val="1"/>
-        </w:numPr>
-        <w:contextualSpacing/>
-      </w:pPr>
-    </w:p>
-    <w:p>
-      <w:pPr>
-        <w:pStyle w:val="ListParagraph"/>
-        <w:numPr>
-          <w:ilvl w:val="0"/>
-          <w:numId w:val="1"/>
-        </w:numPr>
-        <w:contextualSpacing/>
+        <w:ind w:left="480"/>
+      </w:pPr>
+    </w:p>
+    <w:p>
+      <w:pPr>
+        <w:ind w:left="480"/>
       </w:pPr>
     </w:p>
     <w:p>
@@ -7082,82 +7012,42 @@
     </w:p>
     <w:p>
       <w:pPr>
-        <w:pStyle w:val="ListParagraph"/>
-        <w:numPr>
-          <w:ilvl w:val="0"/>
-          <w:numId w:val="1"/>
-        </w:numPr>
-        <w:contextualSpacing/>
-      </w:pPr>
-    </w:p>
-    <w:p>
-      <w:pPr>
-        <w:pStyle w:val="ListParagraph"/>
-        <w:numPr>
-          <w:ilvl w:val="0"/>
-          <w:numId w:val="1"/>
-        </w:numPr>
-        <w:contextualSpacing/>
-      </w:pPr>
-    </w:p>
-    <w:p>
-      <w:pPr>
-        <w:pStyle w:val="ListParagraph"/>
-        <w:numPr>
-          <w:ilvl w:val="0"/>
-          <w:numId w:val="1"/>
-        </w:numPr>
-        <w:contextualSpacing/>
-      </w:pPr>
-    </w:p>
-    <w:p>
-      <w:pPr>
-        <w:pStyle w:val="ListParagraph"/>
-        <w:numPr>
-          <w:ilvl w:val="0"/>
-          <w:numId w:val="1"/>
-        </w:numPr>
-        <w:contextualSpacing/>
-      </w:pPr>
-    </w:p>
-    <w:p>
-      <w:pPr>
-        <w:pStyle w:val="ListParagraph"/>
-        <w:numPr>
-          <w:ilvl w:val="0"/>
-          <w:numId w:val="1"/>
-        </w:numPr>
-        <w:contextualSpacing/>
-      </w:pPr>
-    </w:p>
-    <w:p>
-      <w:pPr>
-        <w:pStyle w:val="ListParagraph"/>
-        <w:numPr>
-          <w:ilvl w:val="0"/>
-          <w:numId w:val="1"/>
-        </w:numPr>
-        <w:contextualSpacing/>
-      </w:pPr>
-    </w:p>
-    <w:p>
-      <w:pPr>
-        <w:pStyle w:val="ListParagraph"/>
-        <w:numPr>
-          <w:ilvl w:val="0"/>
-          <w:numId w:val="1"/>
-        </w:numPr>
-        <w:contextualSpacing/>
-      </w:pPr>
-    </w:p>
-    <w:p>
-      <w:pPr>
-        <w:pStyle w:val="ListParagraph"/>
-        <w:numPr>
-          <w:ilvl w:val="0"/>
-          <w:numId w:val="1"/>
-        </w:numPr>
-        <w:contextualSpacing/>
+        <w:ind w:left="480"/>
+      </w:pPr>
+    </w:p>
+    <w:p>
+      <w:pPr>
+        <w:ind w:left="480"/>
+      </w:pPr>
+    </w:p>
+    <w:p>
+      <w:pPr>
+        <w:ind w:left="480"/>
+      </w:pPr>
+    </w:p>
+    <w:p>
+      <w:pPr>
+        <w:ind w:left="480"/>
+      </w:pPr>
+    </w:p>
+    <w:p>
+      <w:pPr>
+        <w:ind w:left="480"/>
+      </w:pPr>
+    </w:p>
+    <w:p>
+      <w:pPr>
+        <w:ind w:left="480"/>
+      </w:pPr>
+    </w:p>
+    <w:p>
+      <w:pPr>
+        <w:ind w:left="480"/>
+      </w:pPr>
+    </w:p>
+    <w:p>
+      <w:pPr>
+        <w:ind w:left="480"/>
       </w:pPr>
     </w:p>
     <w:p>
@@ -7199,12 +7089,7 @@
     </w:p>
     <w:p>
       <w:pPr>
-        <w:pStyle w:val="ListParagraph"/>
-        <w:numPr>
-          <w:ilvl w:val="0"/>
-          <w:numId w:val="1"/>
-        </w:numPr>
-        <w:contextualSpacing/>
+        <w:ind w:left="480"/>
       </w:pPr>
     </w:p>
     <w:p>
@@ -7237,12 +7122,7 @@
     </w:p>
     <w:p>
       <w:pPr>
-        <w:pStyle w:val="ListParagraph"/>
-        <w:numPr>
-          <w:ilvl w:val="0"/>
-          <w:numId w:val="1"/>
-        </w:numPr>
-        <w:contextualSpacing/>
+        <w:ind w:left="480"/>
       </w:pPr>
     </w:p>
     <w:p>
@@ -7306,22 +7186,12 @@
     </w:p>
     <w:p>
       <w:pPr>
-        <w:pStyle w:val="ListParagraph"/>
-        <w:numPr>
-          <w:ilvl w:val="0"/>
-          <w:numId w:val="1"/>
-        </w:numPr>
-        <w:contextualSpacing/>
-      </w:pPr>
-    </w:p>
-    <w:p>
-      <w:pPr>
-        <w:pStyle w:val="ListParagraph"/>
-        <w:numPr>
-          <w:ilvl w:val="0"/>
-          <w:numId w:val="1"/>
-        </w:numPr>
-        <w:contextualSpacing/>
+        <w:ind w:left="480"/>
+      </w:pPr>
+    </w:p>
+    <w:p>
+      <w:pPr>
+        <w:ind w:left="480"/>
       </w:pPr>
     </w:p>
     <w:p>
@@ -7360,12 +7230,7 @@
     </w:p>
     <w:p>
       <w:pPr>
-        <w:pStyle w:val="ListParagraph"/>
-        <w:numPr>
-          <w:ilvl w:val="0"/>
-          <w:numId w:val="1"/>
-        </w:numPr>
-        <w:contextualSpacing/>
+        <w:ind w:left="480"/>
       </w:pPr>
     </w:p>
     <w:p>
@@ -7427,13 +7292,11 @@
     </w:p>
     <w:p>
       <w:pPr>
-        <w:pStyle w:val="ListParagraph"/>
-        <w:numPr>
-          <w:ilvl w:val="0"/>
-          <w:numId w:val="1"/>
-        </w:numPr>
-        <w:contextualSpacing/>
-      </w:pPr>
+        <w:ind w:left="480"/>
+      </w:pPr>
+      <w:r>
+        <w:t xml:space="preserve">&lt;/body&gt;</w:t>
+      </w:r>
     </w:p>
     <w:p>
       <w:pPr>
@@ -7853,13 +7716,14 @@
     </w:p>
     <w:p>
       <w:pPr>
-        <w:pStyle w:val="ListParagraph"/>
-        <w:numPr>
-          <w:ilvl w:val="0"/>
-          <w:numId w:val="4"/>
-        </w:numPr>
-        <w:contextualSpacing/>
-      </w:pPr>
+        <w:ind w:left="480"/>
+      </w:pPr>
+      <w:r>
+        <w:t xml:space="preserve">]&gt;</w:t>
+      </w:r>
+      <w:r>
+        <w:t xml:space="preserve">&amp;xxe;</w:t>
+      </w:r>
     </w:p>
     <w:p>
       <w:pPr>

</xml_diff>